<commit_message>
Add Email Confirmation process step to Membership Management workflow in web site, MD files, and regenerates PDF and DOCX
</commit_message>
<xml_diff>
--- a/FGI Digital Ecosystem_ Technical Proposal Report.docx
+++ b/FGI Digital Ecosystem_ Technical Proposal Report.docx
@@ -6640,17 +6640,17 @@
           <w:color w:val="333344"/>
           <w:sz w:val="17"/>
         </w:rPr>
-        <w:t>Application --&gt; Review Queue --&gt; Approval/Rejection --&gt; Payment --&gt; Activation</w:t>
+        <w:t>Application --&gt; Email Confirm --&gt; Review Queue --&gt; Approval/Rejection --&gt; Payment --&gt; Activation</w:t>
         <w:br/>
-        <w:t xml:space="preserve">     |              |                |                  |          |</w:t>
+        <w:t xml:space="preserve">     |               |                 |                |                  |          |</w:t>
         <w:br/>
-        <w:t xml:space="preserve">     v              v                v                  v          v</w:t>
+        <w:t xml:space="preserve">     v               v                 v                v                  v          v</w:t>
         <w:br/>
-        <w:t xml:space="preserve">  Form w/        HQ Admin         Email            Stripe      Welcome</w:t>
+        <w:t xml:space="preserve">  Form w/        Verification      HQ Admin         Email            Stripe      Welcome</w:t>
         <w:br/>
-        <w:t xml:space="preserve">  file upload    dashboard        notification     checkout    sequence</w:t>
+        <w:t xml:space="preserve">  file upload    link email        dashboard        notification     checkout    sequence</w:t>
         <w:br/>
-        <w:t xml:space="preserve">                                                               (HubSpot)</w:t>
+        <w:t xml:space="preserve">                                                                                 (HubSpot)</w:t>
       </w:r>
     </w:p>
     <w:p>
@@ -6667,6 +6667,14 @@
       </w:pPr>
       <w:r>
         <w:t>Multi-step application form with document uploads (resume, company info).</w:t>
+      </w:r>
+    </w:p>
+    <w:p>
+      <w:pPr>
+        <w:pStyle w:val="ListBullet"/>
+      </w:pPr>
+      <w:r>
+        <w:t>Automated email confirmation and verification process to prevent spam and validate email addresses.</w:t>
       </w:r>
     </w:p>
     <w:p>

</xml_diff>